<commit_message>
Kim12-1-5-Hucre-Potansiyelini-Etkileyen-Faktorler: gorsel alanlarina Shutter onizlemeleri yerlestirildi (2.3 bicimi)
</commit_message>
<xml_diff>
--- a/Kim12-1-5-Hucre-Potansiyelini-Etkileyen-Faktorler.docx
+++ b/Kim12-1-5-Hucre-Potansiyelini-Etkileyen-Faktorler.docx
@@ -39,85 +39,59 @@
         <w:t xml:space="preserve">Fosil yakıt tüketimini ve egzoz gazlarından kaynaklanan hava kirliliğini azaltmak için elektrikli araçların kullanımı her geçen yıl artmaktadır. Elektrikli araç kullanıcıları, soğuk kış günlerinde aracın tek şarjla gidebildiği mesafenin yaz aylarına göre kısaldığını fark eder (Görsel A). Soğuk bir günde dışarıda kalan telefonun şarjı yeterli görünse bile birden kapanabilir. Uzun süre kullanılan bir pilin gerilimi de giderek düşer. Bir bataryanın ömrünü ve performansını hangi faktörler etkiliyor olabilir? Elektrot olarak kullanılan maddeler, çözeltilerin derişimi ya da sıcaklık değiştiğinde bir galvanik hücrenin potansiyeli nasıl değişir? Bu değişimler, çevreye daha az zarar veren ve daha uzun ömürlü pillerin tasarlanmasında nasıl kullanılabilir? Bu soruların cevabını bir etkinlik yaparak keşfediniz.</w:t>
       </w:r>
     </w:p>
-    <w:tbl>
-      <w:tblPr>
-        <w:tblW w:w="9000" w:type="dxa"/>
+    <w:p>
+      <w:pPr>
         <w:jc w:val="center"/>
-        <w:tblBorders>
-          <w:top w:val="single" w:sz="8" w:space="0" w:color="7F7F7F"/>
-          <w:left w:val="single" w:sz="8" w:space="0" w:color="7F7F7F"/>
-          <w:bottom w:val="single" w:sz="8" w:space="0" w:color="7F7F7F"/>
-          <w:right w:val="single" w:sz="8" w:space="0" w:color="7F7F7F"/>
-        </w:tblBorders>
-      </w:tblPr>
-      <w:tblGrid>
-        <w:gridCol w:w="9000"/>
-      </w:tblGrid>
-      <w:tr>
-        <w:tc>
-          <w:tcPr>
-            <w:tcW w:w="9000" w:type="dxa"/>
-            <w:shd w:val="clear" w:color="auto" w:fill="EDEDED"/>
-          </w:tcPr>
-          <w:p>
-            <w:pPr>
-              <w:jc w:val="both"/>
-              <w:rPr>
-                <w:rFonts w:ascii="Times New Roman" w:hAnsi="Times New Roman" w:cs="Times New Roman"/>
-                <w:lang w:val="tr-TR"/>
-              </w:rPr>
-            </w:pPr>
-            <w:r>
-              <w:rPr>
-                <w:rFonts w:ascii="Times New Roman" w:hAnsi="Times New Roman" w:cs="Times New Roman"/>
-                <w:lang w:val="tr-TR"/>
-              </w:rPr>
-              <w:t xml:space="preserve">GÖRSEL ALANI (Shutterstock)</w:t>
-            </w:r>
-          </w:p>
-          <w:p>
-            <w:pPr>
-              <w:jc w:val="both"/>
-              <w:rPr>
-                <w:rFonts w:ascii="Times New Roman" w:hAnsi="Times New Roman" w:cs="Times New Roman"/>
-                <w:lang w:val="tr-TR"/>
-              </w:rPr>
-            </w:pPr>
-            <w:r>
-              <w:rPr>
-                <w:rFonts w:ascii="Times New Roman" w:hAnsi="Times New Roman" w:cs="Times New Roman"/>
-                <w:lang w:val="tr-TR"/>
-              </w:rPr>
-              <w:t xml:space="preserve">Tarif: Karla kaplı bir otoparkta şarj istasyonuna bağlı elektrikli otomobil; kablo ve şarj ünitesi görünsün. Marka, logo ve plaka görünmesin.</w:t>
-            </w:r>
-          </w:p>
-          <w:p>
-            <w:pPr>
-              <w:jc w:val="both"/>
-              <w:rPr>
-                <w:rFonts w:ascii="Times New Roman" w:hAnsi="Times New Roman" w:cs="Times New Roman"/>
-                <w:lang w:val="tr-TR"/>
-              </w:rPr>
-            </w:pPr>
-            <w:r>
-              <w:rPr>
-                <w:rFonts w:ascii="Times New Roman" w:hAnsi="Times New Roman" w:cs="Times New Roman"/>
-                <w:lang w:val="tr-TR"/>
-              </w:rPr>
-              <w:t xml:space="preserve">Shutter ID: 2729172997 (fotoğraf) — Electric car covered in snow charging</w:t>
-            </w:r>
-          </w:p>
-        </w:tc>
-      </w:tr>
-    </w:tbl>
-    <w:p>
-      <w:pPr>
-        <w:jc w:val="both"/>
-        <w:rPr>
-          <w:rFonts w:ascii="Times New Roman" w:hAnsi="Times New Roman" w:cs="Times New Roman"/>
-          <w:lang w:val="tr-TR"/>
-        </w:rPr>
-      </w:pPr>
+      </w:pPr>
+      <w:r>
+        <w:drawing>
+          <wp:inline xmlns:a="http://schemas.openxmlformats.org/drawingml/2006/main" xmlns:pic="http://schemas.openxmlformats.org/drawingml/2006/picture">
+            <wp:extent cx="3430127" cy="2520000"/>
+            <wp:docPr id="900013" name="Picture 900013"/>
+            <wp:cNvGraphicFramePr>
+              <a:graphicFrameLocks noChangeAspect="1"/>
+            </wp:cNvGraphicFramePr>
+            <a:graphic>
+              <a:graphicData uri="http://schemas.openxmlformats.org/drawingml/2006/picture">
+                <pic:pic>
+                  <pic:nvPicPr>
+                    <pic:cNvPr id="0" name="2729172997_d.jpg"/>
+                    <pic:cNvPicPr/>
+                  </pic:nvPicPr>
+                  <pic:blipFill>
+                    <a:blip r:embed="rId11"/>
+                    <a:stretch>
+                      <a:fillRect/>
+                    </a:stretch>
+                  </pic:blipFill>
+                  <pic:spPr>
+                    <a:xfrm>
+                      <a:off x="0" y="0"/>
+                      <a:ext cx="3430127" cy="2520000"/>
+                    </a:xfrm>
+                    <a:prstGeom prst="rect"/>
+                  </pic:spPr>
+                </pic:pic>
+              </a:graphicData>
+            </a:graphic>
+          </wp:inline>
+        </w:drawing>
+      </w:r>
+    </w:p>
+    <w:p>
+      <w:pPr>
+        <w:jc w:val="center"/>
+      </w:pPr>
+      <w:r>
+        <w:rPr>
+          <w:rFonts w:ascii="Times New Roman" w:hAnsi="Times New Roman" w:cs="Times New Roman"/>
+          <w:b/>
+          <w:bCs/>
+          <w:highlight w:val="yellow"/>
+          <w:lang w:val="tr-TR"/>
+        </w:rPr>
+        <w:t xml:space="preserve">Shutter id: 2729172997</w:t>
+      </w:r>
     </w:p>
     <w:p>
       <w:pPr>
@@ -6986,85 +6960,59 @@
         <w:t xml:space="preserve">Lityum iyon piller cep telefonlarından elektrikli araçlara, insansız hava araçlarından askerî haberleşme cihazlarına kadar pek çok alanda kullanılmaktadır. Bu nedenle pil teknolojisi, ülkelerin enerji ve savunma alanlarında dışa bağımlılığını azaltmak için stratejik öneme sahiptir. Türkiye’de savunma sanayisine uzun yıllardır pil ve batarya üreten ASPİLSAN Enerji, Kayseri’de kurduğu ve Türkiye’nin ilk lityum iyon pil hücresi üretim tesisi olan fabrikada 2022 yılında silindirik lityum iyon pil hücrelerinin seri üretimine başlamıştır (aşağıdaki görsel). Yerli hücre üretimi; savunma sanayisi, elektrikli araçlar ve enerji depolama sistemleri gibi alanlarda ihtiyaç duyulan pillerin yurt içinde üretilmesine katkı sağlamaktadır. Ülkemizin bor gibi zengin maden kaynaklarının ve yetişmiş insan gücünün yeni nesil pil teknolojilerinde değerlendirilmesi, Türkiye’nin kalkınmasına ve bağımsızlığını güçlendirmesine destek olacaktır.</w:t>
       </w:r>
     </w:p>
-    <w:tbl>
-      <w:tblPr>
-        <w:tblW w:w="9000" w:type="dxa"/>
+    <w:p>
+      <w:pPr>
         <w:jc w:val="center"/>
-        <w:tblBorders>
-          <w:top w:val="single" w:sz="8" w:space="0" w:color="7F7F7F"/>
-          <w:left w:val="single" w:sz="8" w:space="0" w:color="7F7F7F"/>
-          <w:bottom w:val="single" w:sz="8" w:space="0" w:color="7F7F7F"/>
-          <w:right w:val="single" w:sz="8" w:space="0" w:color="7F7F7F"/>
-        </w:tblBorders>
-      </w:tblPr>
-      <w:tblGrid>
-        <w:gridCol w:w="9000"/>
-      </w:tblGrid>
-      <w:tr>
-        <w:tc>
-          <w:tcPr>
-            <w:tcW w:w="9000" w:type="dxa"/>
-            <w:shd w:val="clear" w:color="auto" w:fill="EDEDED"/>
-          </w:tcPr>
-          <w:p>
-            <w:pPr>
-              <w:jc w:val="both"/>
-              <w:rPr>
-                <w:rFonts w:ascii="Times New Roman" w:hAnsi="Times New Roman" w:cs="Times New Roman"/>
-                <w:lang w:val="tr-TR"/>
-              </w:rPr>
-            </w:pPr>
-            <w:r>
-              <w:rPr>
-                <w:rFonts w:ascii="Times New Roman" w:hAnsi="Times New Roman" w:cs="Times New Roman"/>
-                <w:lang w:val="tr-TR"/>
-              </w:rPr>
-              <w:t xml:space="preserve">GÖRSEL ALANI (Shutterstock)</w:t>
-            </w:r>
-          </w:p>
-          <w:p>
-            <w:pPr>
-              <w:jc w:val="both"/>
-              <w:rPr>
-                <w:rFonts w:ascii="Times New Roman" w:hAnsi="Times New Roman" w:cs="Times New Roman"/>
-                <w:lang w:val="tr-TR"/>
-              </w:rPr>
-            </w:pPr>
-            <w:r>
-              <w:rPr>
-                <w:rFonts w:ascii="Times New Roman" w:hAnsi="Times New Roman" w:cs="Times New Roman"/>
-                <w:lang w:val="tr-TR"/>
-              </w:rPr>
-              <w:t xml:space="preserve">Tarif: Fabrika ortamında bant üzerinde ilerleyen silindirik lityum iyon pil hücreleri; koruyucu kıyafetli bir teknisyen. Marka ve logo görünmesin.</w:t>
-            </w:r>
-          </w:p>
-          <w:p>
-            <w:pPr>
-              <w:jc w:val="both"/>
-              <w:rPr>
-                <w:rFonts w:ascii="Times New Roman" w:hAnsi="Times New Roman" w:cs="Times New Roman"/>
-                <w:lang w:val="tr-TR"/>
-              </w:rPr>
-            </w:pPr>
-            <w:r>
-              <w:rPr>
-                <w:rFonts w:ascii="Times New Roman" w:hAnsi="Times New Roman" w:cs="Times New Roman"/>
-                <w:lang w:val="tr-TR"/>
-              </w:rPr>
-              <w:t xml:space="preserve">Shutter ID: 2359911527 (fotoğraf) — EV battery production factory, battery cells close-up</w:t>
-            </w:r>
-          </w:p>
-        </w:tc>
-      </w:tr>
-    </w:tbl>
-    <w:p>
-      <w:pPr>
-        <w:jc w:val="both"/>
-        <w:rPr>
-          <w:rFonts w:ascii="Times New Roman" w:hAnsi="Times New Roman" w:cs="Times New Roman"/>
-          <w:lang w:val="tr-TR"/>
-        </w:rPr>
-      </w:pPr>
+      </w:pPr>
+      <w:r>
+        <w:drawing>
+          <wp:inline xmlns:a="http://schemas.openxmlformats.org/drawingml/2006/main" xmlns:pic="http://schemas.openxmlformats.org/drawingml/2006/picture">
+            <wp:extent cx="4004237" cy="2520000"/>
+            <wp:docPr id="900014" name="Picture 900014"/>
+            <wp:cNvGraphicFramePr>
+              <a:graphicFrameLocks noChangeAspect="1"/>
+            </wp:cNvGraphicFramePr>
+            <a:graphic>
+              <a:graphicData uri="http://schemas.openxmlformats.org/drawingml/2006/picture">
+                <pic:pic>
+                  <pic:nvPicPr>
+                    <pic:cNvPr id="0" name="2359911527_d.jpg"/>
+                    <pic:cNvPicPr/>
+                  </pic:nvPicPr>
+                  <pic:blipFill>
+                    <a:blip r:embed="rId12"/>
+                    <a:stretch>
+                      <a:fillRect/>
+                    </a:stretch>
+                  </pic:blipFill>
+                  <pic:spPr>
+                    <a:xfrm>
+                      <a:off x="0" y="0"/>
+                      <a:ext cx="4004237" cy="2520000"/>
+                    </a:xfrm>
+                    <a:prstGeom prst="rect"/>
+                  </pic:spPr>
+                </pic:pic>
+              </a:graphicData>
+            </a:graphic>
+          </wp:inline>
+        </w:drawing>
+      </w:r>
+    </w:p>
+    <w:p>
+      <w:pPr>
+        <w:jc w:val="center"/>
+      </w:pPr>
+      <w:r>
+        <w:rPr>
+          <w:rFonts w:ascii="Times New Roman" w:hAnsi="Times New Roman" w:cs="Times New Roman"/>
+          <w:b/>
+          <w:bCs/>
+          <w:highlight w:val="yellow"/>
+          <w:lang w:val="tr-TR"/>
+        </w:rPr>
+        <w:t xml:space="preserve">Shutter id: 2359911527</w:t>
+      </w:r>
     </w:p>
     <w:p>
       <w:pPr>

</xml_diff>